<commit_message>
Add internal docs, free tools, password gate, chatbot update, and animation fixes
- 7 internal document routes pre-populated with real business content (business plan,
  client contract, proposal, SOW, invoice, welcome pack, Compass report)
- InternalGate password protection on /documents and /sessions (vula2026)
- 10 free resource tools (AI readiness, process improvement, vendor matrix, etc.)
- Ask Compass chatbot updated with free tool awareness and new keyword handlers
- ToolPage, FieldGrid, TextQ, DataTable updated to support pre-populated defaultValues
- BrandIntro animation fixed: no jerk, no awkward pause, skip on internal routes
- documents.tsx restructured as layout with Outlet so child routes render correctly

Co-Authored-By: Claude Sonnet 4.6 <noreply@anthropic.com>
</commit_message>
<xml_diff>
--- a/public/documents/Vula-Business-Plan-2026.docx
+++ b/public/documents/Vula-Business-Plan-2026.docx
@@ -4,55 +4,62 @@
   <w:body>
     <w:p>
       <w:pPr>
-        <w:pBdr>
-          <w:left w:val="thick" w:color="01A1B7" w:sz="24" w:space="6"/>
-        </w:pBdr>
-        <w:spacing w:after="60"/>
+        <w:shd w:fill="0A1628" w:color="auto" w:val="clear"/>
+        <w:spacing w:after="120" w:before="120"/>
       </w:pPr>
       <w:r>
         <w:rPr>
           <w:rFonts w:ascii="Calibri" w:cs="Calibri" w:eastAsia="Calibri" w:hAnsi="Calibri"/>
           <w:b/>
           <w:bCs/>
-          <w:color w:val="01A1B7"/>
+          <w:color w:val="FFFFFF"/>
           <w:sz w:val="40"/>
           <w:szCs w:val="40"/>
         </w:rPr>
-        <w:t xml:space="preserve">VULA</w:t>
-      </w:r>
-      <w:r>
-        <w:rPr>
-          <w:rFonts w:ascii="Calibri" w:cs="Calibri" w:eastAsia="Calibri" w:hAnsi="Calibri"/>
-          <w:color w:val="0A1628"/>
-          <w:sz w:val="28"/>
-          <w:szCs w:val="28"/>
+        <w:t xml:space="preserve">  VULA</w:t>
+      </w:r>
+      <w:r>
+        <w:rPr>
+          <w:rFonts w:ascii="Calibri" w:cs="Calibri" w:eastAsia="Calibri" w:hAnsi="Calibri"/>
+          <w:color w:val="A8C4CC"/>
+          <w:sz w:val="26"/>
+          <w:szCs w:val="26"/>
         </w:rPr>
         <w:t xml:space="preserve">  Solutions</w:t>
       </w:r>
     </w:p>
     <w:p>
       <w:pPr>
-        <w:pBdr>
-          <w:bottom w:val="single" w:color="01A1B7" w:sz="6"/>
-        </w:pBdr>
-        <w:spacing w:after="240"/>
-      </w:pPr>
-    </w:p>
-    <w:p>
-      <w:pPr>
+        <w:shd w:fill="01A1B7" w:color="auto" w:val="clear"/>
         <w:spacing w:after="0" w:before="0"/>
       </w:pPr>
       <w:r>
         <w:rPr>
-          <w:sz w:val="64"/>
-          <w:szCs w:val="64"/>
-        </w:rPr>
-        <w:t xml:space="preserve"/>
-      </w:r>
-    </w:p>
-    <w:p>
-      <w:pPr>
-        <w:spacing w:after="240" w:before="0"/>
+          <w:rFonts w:ascii="Calibri" w:cs="Calibri" w:eastAsia="Calibri" w:hAnsi="Calibri"/>
+          <w:sz w:val="4"/>
+          <w:szCs w:val="4"/>
+        </w:rPr>
+        <w:t xml:space="preserve"> </w:t>
+      </w:r>
+    </w:p>
+    <w:p>
+      <w:pPr>
+        <w:shd w:fill="0A1628" w:color="auto" w:val="clear"/>
+        <w:spacing w:after="0" w:before="0"/>
+      </w:pPr>
+      <w:r>
+        <w:rPr>
+          <w:rFonts w:ascii="Calibri" w:cs="Calibri" w:eastAsia="Calibri" w:hAnsi="Calibri"/>
+          <w:sz w:val="16"/>
+          <w:szCs w:val="16"/>
+        </w:rPr>
+        <w:t xml:space="preserve"> </w:t>
+      </w:r>
+    </w:p>
+    <w:p>
+      <w:pPr>
+        <w:shd w:fill="0A1628" w:color="auto" w:val="clear"/>
+        <w:spacing w:after="120" w:before="0"/>
         <w:jc w:val="left"/>
       </w:pPr>
       <w:r>
@@ -60,7 +67,7 @@
           <w:rFonts w:ascii="Calibri" w:cs="Calibri" w:eastAsia="Calibri" w:hAnsi="Calibri"/>
           <w:b/>
           <w:bCs/>
-          <w:color w:val="0A1628"/>
+          <w:color w:val="FFFFFF"/>
           <w:sz w:val="56"/>
           <w:szCs w:val="56"/>
         </w:rPr>
@@ -69,7 +76,8 @@
     </w:p>
     <w:p>
       <w:pPr>
-        <w:spacing w:after="480" w:before="0"/>
+        <w:shd w:fill="0A1628" w:color="auto" w:val="clear"/>
+        <w:spacing w:after="0" w:before="0"/>
       </w:pPr>
       <w:r>
         <w:rPr>
@@ -79,6 +87,32 @@
           <w:szCs w:val="28"/>
         </w:rPr>
         <w:t xml:space="preserve">Vula Solutions (Pty) Ltd</w:t>
+      </w:r>
+    </w:p>
+    <w:p>
+      <w:pPr>
+        <w:shd w:fill="0A1628" w:color="auto" w:val="clear"/>
+        <w:spacing w:after="0" w:before="0"/>
+      </w:pPr>
+      <w:r>
+        <w:rPr>
+          <w:rFonts w:ascii="Calibri" w:cs="Calibri" w:eastAsia="Calibri" w:hAnsi="Calibri"/>
+          <w:sz w:val="24"/>
+          <w:szCs w:val="24"/>
+        </w:rPr>
+        <w:t xml:space="preserve"> </w:t>
+      </w:r>
+    </w:p>
+    <w:p>
+      <w:pPr>
+        <w:spacing w:after="0" w:before="0"/>
+      </w:pPr>
+      <w:r>
+        <w:rPr>
+          <w:sz w:val="32"/>
+          <w:szCs w:val="32"/>
+        </w:rPr>
+        <w:t xml:space="preserve"/>
       </w:r>
     </w:p>
     <w:p>
@@ -625,13 +659,18 @@
     </w:p>
     <w:p>
       <w:pPr>
-        <w:pStyle w:val="ListParagraph"/>
-        <w:numPr>
-          <w:ilvl w:val="0"/>
-          <w:numId w:val="1"/>
-        </w:numPr>
         <w:spacing w:after="80" w:before="0"/>
-      </w:pPr>
+        <w:ind w:left="480" w:hanging="320"/>
+      </w:pPr>
+      <w:r>
+        <w:rPr>
+          <w:rFonts w:ascii="Calibri" w:cs="Calibri" w:eastAsia="Calibri" w:hAnsi="Calibri"/>
+          <w:color w:val="01A1B7"/>
+          <w:sz w:val="20"/>
+          <w:szCs w:val="20"/>
+        </w:rPr>
+        <w:t xml:space="preserve">▸  </w:t>
+      </w:r>
       <w:r>
         <w:rPr>
           <w:rFonts w:ascii="Calibri" w:cs="Calibri" w:eastAsia="Calibri" w:hAnsi="Calibri"/>
@@ -643,13 +682,18 @@
     </w:p>
     <w:p>
       <w:pPr>
-        <w:pStyle w:val="ListParagraph"/>
-        <w:numPr>
-          <w:ilvl w:val="0"/>
-          <w:numId w:val="1"/>
-        </w:numPr>
         <w:spacing w:after="80" w:before="0"/>
-      </w:pPr>
+        <w:ind w:left="480" w:hanging="320"/>
+      </w:pPr>
+      <w:r>
+        <w:rPr>
+          <w:rFonts w:ascii="Calibri" w:cs="Calibri" w:eastAsia="Calibri" w:hAnsi="Calibri"/>
+          <w:color w:val="01A1B7"/>
+          <w:sz w:val="20"/>
+          <w:szCs w:val="20"/>
+        </w:rPr>
+        <w:t xml:space="preserve">▸  </w:t>
+      </w:r>
       <w:r>
         <w:rPr>
           <w:rFonts w:ascii="Calibri" w:cs="Calibri" w:eastAsia="Calibri" w:hAnsi="Calibri"/>
@@ -661,13 +705,18 @@
     </w:p>
     <w:p>
       <w:pPr>
-        <w:pStyle w:val="ListParagraph"/>
-        <w:numPr>
-          <w:ilvl w:val="0"/>
-          <w:numId w:val="1"/>
-        </w:numPr>
         <w:spacing w:after="80" w:before="0"/>
-      </w:pPr>
+        <w:ind w:left="480" w:hanging="320"/>
+      </w:pPr>
+      <w:r>
+        <w:rPr>
+          <w:rFonts w:ascii="Calibri" w:cs="Calibri" w:eastAsia="Calibri" w:hAnsi="Calibri"/>
+          <w:color w:val="01A1B7"/>
+          <w:sz w:val="20"/>
+          <w:szCs w:val="20"/>
+        </w:rPr>
+        <w:t xml:space="preserve">▸  </w:t>
+      </w:r>
       <w:r>
         <w:rPr>
           <w:rFonts w:ascii="Calibri" w:cs="Calibri" w:eastAsia="Calibri" w:hAnsi="Calibri"/>
@@ -679,13 +728,18 @@
     </w:p>
     <w:p>
       <w:pPr>
-        <w:pStyle w:val="ListParagraph"/>
-        <w:numPr>
-          <w:ilvl w:val="0"/>
-          <w:numId w:val="1"/>
-        </w:numPr>
         <w:spacing w:after="80" w:before="0"/>
-      </w:pPr>
+        <w:ind w:left="480" w:hanging="320"/>
+      </w:pPr>
+      <w:r>
+        <w:rPr>
+          <w:rFonts w:ascii="Calibri" w:cs="Calibri" w:eastAsia="Calibri" w:hAnsi="Calibri"/>
+          <w:color w:val="01A1B7"/>
+          <w:sz w:val="20"/>
+          <w:szCs w:val="20"/>
+        </w:rPr>
+        <w:t xml:space="preserve">▸  </w:t>
+      </w:r>
       <w:r>
         <w:rPr>
           <w:rFonts w:ascii="Calibri" w:cs="Calibri" w:eastAsia="Calibri" w:hAnsi="Calibri"/>
@@ -697,13 +751,18 @@
     </w:p>
     <w:p>
       <w:pPr>
-        <w:pStyle w:val="ListParagraph"/>
-        <w:numPr>
-          <w:ilvl w:val="0"/>
-          <w:numId w:val="1"/>
-        </w:numPr>
         <w:spacing w:after="80" w:before="0"/>
-      </w:pPr>
+        <w:ind w:left="480" w:hanging="320"/>
+      </w:pPr>
+      <w:r>
+        <w:rPr>
+          <w:rFonts w:ascii="Calibri" w:cs="Calibri" w:eastAsia="Calibri" w:hAnsi="Calibri"/>
+          <w:color w:val="01A1B7"/>
+          <w:sz w:val="20"/>
+          <w:szCs w:val="20"/>
+        </w:rPr>
+        <w:t xml:space="preserve">▸  </w:t>
+      </w:r>
       <w:r>
         <w:rPr>
           <w:rFonts w:ascii="Calibri" w:cs="Calibri" w:eastAsia="Calibri" w:hAnsi="Calibri"/>
@@ -762,13 +821,18 @@
     </w:p>
     <w:p>
       <w:pPr>
-        <w:pStyle w:val="ListParagraph"/>
-        <w:numPr>
-          <w:ilvl w:val="0"/>
-          <w:numId w:val="1"/>
-        </w:numPr>
         <w:spacing w:after="80" w:before="0"/>
-      </w:pPr>
+        <w:ind w:left="480" w:hanging="320"/>
+      </w:pPr>
+      <w:r>
+        <w:rPr>
+          <w:rFonts w:ascii="Calibri" w:cs="Calibri" w:eastAsia="Calibri" w:hAnsi="Calibri"/>
+          <w:color w:val="01A1B7"/>
+          <w:sz w:val="20"/>
+          <w:szCs w:val="20"/>
+        </w:rPr>
+        <w:t xml:space="preserve">▸  </w:t>
+      </w:r>
       <w:r>
         <w:rPr>
           <w:rFonts w:ascii="Calibri" w:cs="Calibri" w:eastAsia="Calibri" w:hAnsi="Calibri"/>
@@ -780,13 +844,18 @@
     </w:p>
     <w:p>
       <w:pPr>
-        <w:pStyle w:val="ListParagraph"/>
-        <w:numPr>
-          <w:ilvl w:val="0"/>
-          <w:numId w:val="1"/>
-        </w:numPr>
         <w:spacing w:after="80" w:before="0"/>
-      </w:pPr>
+        <w:ind w:left="480" w:hanging="320"/>
+      </w:pPr>
+      <w:r>
+        <w:rPr>
+          <w:rFonts w:ascii="Calibri" w:cs="Calibri" w:eastAsia="Calibri" w:hAnsi="Calibri"/>
+          <w:color w:val="01A1B7"/>
+          <w:sz w:val="20"/>
+          <w:szCs w:val="20"/>
+        </w:rPr>
+        <w:t xml:space="preserve">▸  </w:t>
+      </w:r>
       <w:r>
         <w:rPr>
           <w:rFonts w:ascii="Calibri" w:cs="Calibri" w:eastAsia="Calibri" w:hAnsi="Calibri"/>
@@ -798,13 +867,18 @@
     </w:p>
     <w:p>
       <w:pPr>
-        <w:pStyle w:val="ListParagraph"/>
-        <w:numPr>
-          <w:ilvl w:val="0"/>
-          <w:numId w:val="1"/>
-        </w:numPr>
         <w:spacing w:after="80" w:before="0"/>
-      </w:pPr>
+        <w:ind w:left="480" w:hanging="320"/>
+      </w:pPr>
+      <w:r>
+        <w:rPr>
+          <w:rFonts w:ascii="Calibri" w:cs="Calibri" w:eastAsia="Calibri" w:hAnsi="Calibri"/>
+          <w:color w:val="01A1B7"/>
+          <w:sz w:val="20"/>
+          <w:szCs w:val="20"/>
+        </w:rPr>
+        <w:t xml:space="preserve">▸  </w:t>
+      </w:r>
       <w:r>
         <w:rPr>
           <w:rFonts w:ascii="Calibri" w:cs="Calibri" w:eastAsia="Calibri" w:hAnsi="Calibri"/>
@@ -816,13 +890,18 @@
     </w:p>
     <w:p>
       <w:pPr>
-        <w:pStyle w:val="ListParagraph"/>
-        <w:numPr>
-          <w:ilvl w:val="0"/>
-          <w:numId w:val="1"/>
-        </w:numPr>
         <w:spacing w:after="80" w:before="0"/>
-      </w:pPr>
+        <w:ind w:left="480" w:hanging="320"/>
+      </w:pPr>
+      <w:r>
+        <w:rPr>
+          <w:rFonts w:ascii="Calibri" w:cs="Calibri" w:eastAsia="Calibri" w:hAnsi="Calibri"/>
+          <w:color w:val="01A1B7"/>
+          <w:sz w:val="20"/>
+          <w:szCs w:val="20"/>
+        </w:rPr>
+        <w:t xml:space="preserve">▸  </w:t>
+      </w:r>
       <w:r>
         <w:rPr>
           <w:rFonts w:ascii="Calibri" w:cs="Calibri" w:eastAsia="Calibri" w:hAnsi="Calibri"/>
@@ -834,13 +913,18 @@
     </w:p>
     <w:p>
       <w:pPr>
-        <w:pStyle w:val="ListParagraph"/>
-        <w:numPr>
-          <w:ilvl w:val="0"/>
-          <w:numId w:val="1"/>
-        </w:numPr>
         <w:spacing w:after="80" w:before="0"/>
-      </w:pPr>
+        <w:ind w:left="480" w:hanging="320"/>
+      </w:pPr>
+      <w:r>
+        <w:rPr>
+          <w:rFonts w:ascii="Calibri" w:cs="Calibri" w:eastAsia="Calibri" w:hAnsi="Calibri"/>
+          <w:color w:val="01A1B7"/>
+          <w:sz w:val="20"/>
+          <w:szCs w:val="20"/>
+        </w:rPr>
+        <w:t xml:space="preserve">▸  </w:t>
+      </w:r>
       <w:r>
         <w:rPr>
           <w:rFonts w:ascii="Calibri" w:cs="Calibri" w:eastAsia="Calibri" w:hAnsi="Calibri"/>
@@ -2353,13 +2437,18 @@
     </w:p>
     <w:p>
       <w:pPr>
-        <w:pStyle w:val="ListParagraph"/>
-        <w:numPr>
-          <w:ilvl w:val="0"/>
-          <w:numId w:val="1"/>
-        </w:numPr>
         <w:spacing w:after="80" w:before="0"/>
-      </w:pPr>
+        <w:ind w:left="480" w:hanging="320"/>
+      </w:pPr>
+      <w:r>
+        <w:rPr>
+          <w:rFonts w:ascii="Calibri" w:cs="Calibri" w:eastAsia="Calibri" w:hAnsi="Calibri"/>
+          <w:color w:val="01A1B7"/>
+          <w:sz w:val="20"/>
+          <w:szCs w:val="20"/>
+        </w:rPr>
+        <w:t xml:space="preserve">▸  </w:t>
+      </w:r>
       <w:r>
         <w:rPr>
           <w:rFonts w:ascii="Calibri" w:cs="Calibri" w:eastAsia="Calibri" w:hAnsi="Calibri"/>
@@ -2371,13 +2460,18 @@
     </w:p>
     <w:p>
       <w:pPr>
-        <w:pStyle w:val="ListParagraph"/>
-        <w:numPr>
-          <w:ilvl w:val="0"/>
-          <w:numId w:val="1"/>
-        </w:numPr>
         <w:spacing w:after="80" w:before="0"/>
-      </w:pPr>
+        <w:ind w:left="480" w:hanging="320"/>
+      </w:pPr>
+      <w:r>
+        <w:rPr>
+          <w:rFonts w:ascii="Calibri" w:cs="Calibri" w:eastAsia="Calibri" w:hAnsi="Calibri"/>
+          <w:color w:val="01A1B7"/>
+          <w:sz w:val="20"/>
+          <w:szCs w:val="20"/>
+        </w:rPr>
+        <w:t xml:space="preserve">▸  </w:t>
+      </w:r>
       <w:r>
         <w:rPr>
           <w:rFonts w:ascii="Calibri" w:cs="Calibri" w:eastAsia="Calibri" w:hAnsi="Calibri"/>
@@ -2389,13 +2483,18 @@
     </w:p>
     <w:p>
       <w:pPr>
-        <w:pStyle w:val="ListParagraph"/>
-        <w:numPr>
-          <w:ilvl w:val="0"/>
-          <w:numId w:val="1"/>
-        </w:numPr>
         <w:spacing w:after="80" w:before="0"/>
-      </w:pPr>
+        <w:ind w:left="480" w:hanging="320"/>
+      </w:pPr>
+      <w:r>
+        <w:rPr>
+          <w:rFonts w:ascii="Calibri" w:cs="Calibri" w:eastAsia="Calibri" w:hAnsi="Calibri"/>
+          <w:color w:val="01A1B7"/>
+          <w:sz w:val="20"/>
+          <w:szCs w:val="20"/>
+        </w:rPr>
+        <w:t xml:space="preserve">▸  </w:t>
+      </w:r>
       <w:r>
         <w:rPr>
           <w:rFonts w:ascii="Calibri" w:cs="Calibri" w:eastAsia="Calibri" w:hAnsi="Calibri"/>
@@ -2473,13 +2572,18 @@
     </w:p>
     <w:p>
       <w:pPr>
-        <w:pStyle w:val="ListParagraph"/>
-        <w:numPr>
-          <w:ilvl w:val="0"/>
-          <w:numId w:val="1"/>
-        </w:numPr>
         <w:spacing w:after="80" w:before="0"/>
-      </w:pPr>
+        <w:ind w:left="480" w:hanging="320"/>
+      </w:pPr>
+      <w:r>
+        <w:rPr>
+          <w:rFonts w:ascii="Calibri" w:cs="Calibri" w:eastAsia="Calibri" w:hAnsi="Calibri"/>
+          <w:color w:val="01A1B7"/>
+          <w:sz w:val="20"/>
+          <w:szCs w:val="20"/>
+        </w:rPr>
+        <w:t xml:space="preserve">▸  </w:t>
+      </w:r>
       <w:r>
         <w:rPr>
           <w:rFonts w:ascii="Calibri" w:cs="Calibri" w:eastAsia="Calibri" w:hAnsi="Calibri"/>
@@ -2491,13 +2595,18 @@
     </w:p>
     <w:p>
       <w:pPr>
-        <w:pStyle w:val="ListParagraph"/>
-        <w:numPr>
-          <w:ilvl w:val="0"/>
-          <w:numId w:val="1"/>
-        </w:numPr>
         <w:spacing w:after="80" w:before="0"/>
-      </w:pPr>
+        <w:ind w:left="480" w:hanging="320"/>
+      </w:pPr>
+      <w:r>
+        <w:rPr>
+          <w:rFonts w:ascii="Calibri" w:cs="Calibri" w:eastAsia="Calibri" w:hAnsi="Calibri"/>
+          <w:color w:val="01A1B7"/>
+          <w:sz w:val="20"/>
+          <w:szCs w:val="20"/>
+        </w:rPr>
+        <w:t xml:space="preserve">▸  </w:t>
+      </w:r>
       <w:r>
         <w:rPr>
           <w:rFonts w:ascii="Calibri" w:cs="Calibri" w:eastAsia="Calibri" w:hAnsi="Calibri"/>
@@ -2509,13 +2618,18 @@
     </w:p>
     <w:p>
       <w:pPr>
-        <w:pStyle w:val="ListParagraph"/>
-        <w:numPr>
-          <w:ilvl w:val="0"/>
-          <w:numId w:val="1"/>
-        </w:numPr>
         <w:spacing w:after="80" w:before="0"/>
-      </w:pPr>
+        <w:ind w:left="480" w:hanging="320"/>
+      </w:pPr>
+      <w:r>
+        <w:rPr>
+          <w:rFonts w:ascii="Calibri" w:cs="Calibri" w:eastAsia="Calibri" w:hAnsi="Calibri"/>
+          <w:color w:val="01A1B7"/>
+          <w:sz w:val="20"/>
+          <w:szCs w:val="20"/>
+        </w:rPr>
+        <w:t xml:space="preserve">▸  </w:t>
+      </w:r>
       <w:r>
         <w:rPr>
           <w:rFonts w:ascii="Calibri" w:cs="Calibri" w:eastAsia="Calibri" w:hAnsi="Calibri"/>
@@ -2527,13 +2641,18 @@
     </w:p>
     <w:p>
       <w:pPr>
-        <w:pStyle w:val="ListParagraph"/>
-        <w:numPr>
-          <w:ilvl w:val="0"/>
-          <w:numId w:val="1"/>
-        </w:numPr>
         <w:spacing w:after="80" w:before="0"/>
-      </w:pPr>
+        <w:ind w:left="480" w:hanging="320"/>
+      </w:pPr>
+      <w:r>
+        <w:rPr>
+          <w:rFonts w:ascii="Calibri" w:cs="Calibri" w:eastAsia="Calibri" w:hAnsi="Calibri"/>
+          <w:color w:val="01A1B7"/>
+          <w:sz w:val="20"/>
+          <w:szCs w:val="20"/>
+        </w:rPr>
+        <w:t xml:space="preserve">▸  </w:t>
+      </w:r>
       <w:r>
         <w:rPr>
           <w:rFonts w:ascii="Calibri" w:cs="Calibri" w:eastAsia="Calibri" w:hAnsi="Calibri"/>
@@ -2576,13 +2695,18 @@
     </w:p>
     <w:p>
       <w:pPr>
-        <w:pStyle w:val="ListParagraph"/>
-        <w:numPr>
-          <w:ilvl w:val="0"/>
-          <w:numId w:val="1"/>
-        </w:numPr>
         <w:spacing w:after="80" w:before="0"/>
-      </w:pPr>
+        <w:ind w:left="480" w:hanging="320"/>
+      </w:pPr>
+      <w:r>
+        <w:rPr>
+          <w:rFonts w:ascii="Calibri" w:cs="Calibri" w:eastAsia="Calibri" w:hAnsi="Calibri"/>
+          <w:color w:val="01A1B7"/>
+          <w:sz w:val="20"/>
+          <w:szCs w:val="20"/>
+        </w:rPr>
+        <w:t xml:space="preserve">▸  </w:t>
+      </w:r>
       <w:r>
         <w:rPr>
           <w:rFonts w:ascii="Calibri" w:cs="Calibri" w:eastAsia="Calibri" w:hAnsi="Calibri"/>
@@ -2594,13 +2718,18 @@
     </w:p>
     <w:p>
       <w:pPr>
-        <w:pStyle w:val="ListParagraph"/>
-        <w:numPr>
-          <w:ilvl w:val="0"/>
-          <w:numId w:val="1"/>
-        </w:numPr>
         <w:spacing w:after="80" w:before="0"/>
-      </w:pPr>
+        <w:ind w:left="480" w:hanging="320"/>
+      </w:pPr>
+      <w:r>
+        <w:rPr>
+          <w:rFonts w:ascii="Calibri" w:cs="Calibri" w:eastAsia="Calibri" w:hAnsi="Calibri"/>
+          <w:color w:val="01A1B7"/>
+          <w:sz w:val="20"/>
+          <w:szCs w:val="20"/>
+        </w:rPr>
+        <w:t xml:space="preserve">▸  </w:t>
+      </w:r>
       <w:r>
         <w:rPr>
           <w:rFonts w:ascii="Calibri" w:cs="Calibri" w:eastAsia="Calibri" w:hAnsi="Calibri"/>
@@ -2612,13 +2741,18 @@
     </w:p>
     <w:p>
       <w:pPr>
-        <w:pStyle w:val="ListParagraph"/>
-        <w:numPr>
-          <w:ilvl w:val="0"/>
-          <w:numId w:val="1"/>
-        </w:numPr>
         <w:spacing w:after="80" w:before="0"/>
-      </w:pPr>
+        <w:ind w:left="480" w:hanging="320"/>
+      </w:pPr>
+      <w:r>
+        <w:rPr>
+          <w:rFonts w:ascii="Calibri" w:cs="Calibri" w:eastAsia="Calibri" w:hAnsi="Calibri"/>
+          <w:color w:val="01A1B7"/>
+          <w:sz w:val="20"/>
+          <w:szCs w:val="20"/>
+        </w:rPr>
+        <w:t xml:space="preserve">▸  </w:t>
+      </w:r>
       <w:r>
         <w:rPr>
           <w:rFonts w:ascii="Calibri" w:cs="Calibri" w:eastAsia="Calibri" w:hAnsi="Calibri"/>
@@ -2630,13 +2764,18 @@
     </w:p>
     <w:p>
       <w:pPr>
-        <w:pStyle w:val="ListParagraph"/>
-        <w:numPr>
-          <w:ilvl w:val="0"/>
-          <w:numId w:val="1"/>
-        </w:numPr>
         <w:spacing w:after="80" w:before="0"/>
-      </w:pPr>
+        <w:ind w:left="480" w:hanging="320"/>
+      </w:pPr>
+      <w:r>
+        <w:rPr>
+          <w:rFonts w:ascii="Calibri" w:cs="Calibri" w:eastAsia="Calibri" w:hAnsi="Calibri"/>
+          <w:color w:val="01A1B7"/>
+          <w:sz w:val="20"/>
+          <w:szCs w:val="20"/>
+        </w:rPr>
+        <w:t xml:space="preserve">▸  </w:t>
+      </w:r>
       <w:r>
         <w:rPr>
           <w:rFonts w:ascii="Calibri" w:cs="Calibri" w:eastAsia="Calibri" w:hAnsi="Calibri"/>
@@ -2648,13 +2787,18 @@
     </w:p>
     <w:p>
       <w:pPr>
-        <w:pStyle w:val="ListParagraph"/>
-        <w:numPr>
-          <w:ilvl w:val="0"/>
-          <w:numId w:val="1"/>
-        </w:numPr>
         <w:spacing w:after="80" w:before="0"/>
-      </w:pPr>
+        <w:ind w:left="480" w:hanging="320"/>
+      </w:pPr>
+      <w:r>
+        <w:rPr>
+          <w:rFonts w:ascii="Calibri" w:cs="Calibri" w:eastAsia="Calibri" w:hAnsi="Calibri"/>
+          <w:color w:val="01A1B7"/>
+          <w:sz w:val="20"/>
+          <w:szCs w:val="20"/>
+        </w:rPr>
+        <w:t xml:space="preserve">▸  </w:t>
+      </w:r>
       <w:r>
         <w:rPr>
           <w:rFonts w:ascii="Calibri" w:cs="Calibri" w:eastAsia="Calibri" w:hAnsi="Calibri"/>
@@ -2666,13 +2810,18 @@
     </w:p>
     <w:p>
       <w:pPr>
-        <w:pStyle w:val="ListParagraph"/>
-        <w:numPr>
-          <w:ilvl w:val="0"/>
-          <w:numId w:val="1"/>
-        </w:numPr>
         <w:spacing w:after="80" w:before="0"/>
-      </w:pPr>
+        <w:ind w:left="480" w:hanging="320"/>
+      </w:pPr>
+      <w:r>
+        <w:rPr>
+          <w:rFonts w:ascii="Calibri" w:cs="Calibri" w:eastAsia="Calibri" w:hAnsi="Calibri"/>
+          <w:color w:val="01A1B7"/>
+          <w:sz w:val="20"/>
+          <w:szCs w:val="20"/>
+        </w:rPr>
+        <w:t xml:space="preserve">▸  </w:t>
+      </w:r>
       <w:r>
         <w:rPr>
           <w:rFonts w:ascii="Calibri" w:cs="Calibri" w:eastAsia="Calibri" w:hAnsi="Calibri"/>
@@ -3130,13 +3279,18 @@
     </w:p>
     <w:p>
       <w:pPr>
-        <w:pStyle w:val="ListParagraph"/>
-        <w:numPr>
-          <w:ilvl w:val="0"/>
-          <w:numId w:val="1"/>
-        </w:numPr>
         <w:spacing w:after="80" w:before="0"/>
-      </w:pPr>
+        <w:ind w:left="480" w:hanging="320"/>
+      </w:pPr>
+      <w:r>
+        <w:rPr>
+          <w:rFonts w:ascii="Calibri" w:cs="Calibri" w:eastAsia="Calibri" w:hAnsi="Calibri"/>
+          <w:color w:val="01A1B7"/>
+          <w:sz w:val="20"/>
+          <w:szCs w:val="20"/>
+        </w:rPr>
+        <w:t xml:space="preserve">▸  </w:t>
+      </w:r>
       <w:r>
         <w:rPr>
           <w:rFonts w:ascii="Calibri" w:cs="Calibri" w:eastAsia="Calibri" w:hAnsi="Calibri"/>
@@ -3148,13 +3302,18 @@
     </w:p>
     <w:p>
       <w:pPr>
-        <w:pStyle w:val="ListParagraph"/>
-        <w:numPr>
-          <w:ilvl w:val="0"/>
-          <w:numId w:val="1"/>
-        </w:numPr>
         <w:spacing w:after="80" w:before="0"/>
-      </w:pPr>
+        <w:ind w:left="480" w:hanging="320"/>
+      </w:pPr>
+      <w:r>
+        <w:rPr>
+          <w:rFonts w:ascii="Calibri" w:cs="Calibri" w:eastAsia="Calibri" w:hAnsi="Calibri"/>
+          <w:color w:val="01A1B7"/>
+          <w:sz w:val="20"/>
+          <w:szCs w:val="20"/>
+        </w:rPr>
+        <w:t xml:space="preserve">▸  </w:t>
+      </w:r>
       <w:r>
         <w:rPr>
           <w:rFonts w:ascii="Calibri" w:cs="Calibri" w:eastAsia="Calibri" w:hAnsi="Calibri"/>
@@ -3166,13 +3325,18 @@
     </w:p>
     <w:p>
       <w:pPr>
-        <w:pStyle w:val="ListParagraph"/>
-        <w:numPr>
-          <w:ilvl w:val="0"/>
-          <w:numId w:val="1"/>
-        </w:numPr>
         <w:spacing w:after="80" w:before="0"/>
-      </w:pPr>
+        <w:ind w:left="480" w:hanging="320"/>
+      </w:pPr>
+      <w:r>
+        <w:rPr>
+          <w:rFonts w:ascii="Calibri" w:cs="Calibri" w:eastAsia="Calibri" w:hAnsi="Calibri"/>
+          <w:color w:val="01A1B7"/>
+          <w:sz w:val="20"/>
+          <w:szCs w:val="20"/>
+        </w:rPr>
+        <w:t xml:space="preserve">▸  </w:t>
+      </w:r>
       <w:r>
         <w:rPr>
           <w:rFonts w:ascii="Calibri" w:cs="Calibri" w:eastAsia="Calibri" w:hAnsi="Calibri"/>
@@ -3184,13 +3348,18 @@
     </w:p>
     <w:p>
       <w:pPr>
-        <w:pStyle w:val="ListParagraph"/>
-        <w:numPr>
-          <w:ilvl w:val="0"/>
-          <w:numId w:val="1"/>
-        </w:numPr>
         <w:spacing w:after="80" w:before="0"/>
-      </w:pPr>
+        <w:ind w:left="480" w:hanging="320"/>
+      </w:pPr>
+      <w:r>
+        <w:rPr>
+          <w:rFonts w:ascii="Calibri" w:cs="Calibri" w:eastAsia="Calibri" w:hAnsi="Calibri"/>
+          <w:color w:val="01A1B7"/>
+          <w:sz w:val="20"/>
+          <w:szCs w:val="20"/>
+        </w:rPr>
+        <w:t xml:space="preserve">▸  </w:t>
+      </w:r>
       <w:r>
         <w:rPr>
           <w:rFonts w:ascii="Calibri" w:cs="Calibri" w:eastAsia="Calibri" w:hAnsi="Calibri"/>
@@ -3202,13 +3371,18 @@
     </w:p>
     <w:p>
       <w:pPr>
-        <w:pStyle w:val="ListParagraph"/>
-        <w:numPr>
-          <w:ilvl w:val="0"/>
-          <w:numId w:val="1"/>
-        </w:numPr>
         <w:spacing w:after="80" w:before="0"/>
-      </w:pPr>
+        <w:ind w:left="480" w:hanging="320"/>
+      </w:pPr>
+      <w:r>
+        <w:rPr>
+          <w:rFonts w:ascii="Calibri" w:cs="Calibri" w:eastAsia="Calibri" w:hAnsi="Calibri"/>
+          <w:color w:val="01A1B7"/>
+          <w:sz w:val="20"/>
+          <w:szCs w:val="20"/>
+        </w:rPr>
+        <w:t xml:space="preserve">▸  </w:t>
+      </w:r>
       <w:r>
         <w:rPr>
           <w:rFonts w:ascii="Calibri" w:cs="Calibri" w:eastAsia="Calibri" w:hAnsi="Calibri"/>
@@ -3220,13 +3394,18 @@
     </w:p>
     <w:p>
       <w:pPr>
-        <w:pStyle w:val="ListParagraph"/>
-        <w:numPr>
-          <w:ilvl w:val="0"/>
-          <w:numId w:val="1"/>
-        </w:numPr>
         <w:spacing w:after="80" w:before="0"/>
-      </w:pPr>
+        <w:ind w:left="480" w:hanging="320"/>
+      </w:pPr>
+      <w:r>
+        <w:rPr>
+          <w:rFonts w:ascii="Calibri" w:cs="Calibri" w:eastAsia="Calibri" w:hAnsi="Calibri"/>
+          <w:color w:val="01A1B7"/>
+          <w:sz w:val="20"/>
+          <w:szCs w:val="20"/>
+        </w:rPr>
+        <w:t xml:space="preserve">▸  </w:t>
+      </w:r>
       <w:r>
         <w:rPr>
           <w:rFonts w:ascii="Calibri" w:cs="Calibri" w:eastAsia="Calibri" w:hAnsi="Calibri"/>
@@ -3286,13 +3465,18 @@
     </w:p>
     <w:p>
       <w:pPr>
-        <w:pStyle w:val="ListParagraph"/>
-        <w:numPr>
-          <w:ilvl w:val="0"/>
-          <w:numId w:val="1"/>
-        </w:numPr>
         <w:spacing w:after="80" w:before="0"/>
-      </w:pPr>
+        <w:ind w:left="480" w:hanging="320"/>
+      </w:pPr>
+      <w:r>
+        <w:rPr>
+          <w:rFonts w:ascii="Calibri" w:cs="Calibri" w:eastAsia="Calibri" w:hAnsi="Calibri"/>
+          <w:color w:val="01A1B7"/>
+          <w:sz w:val="20"/>
+          <w:szCs w:val="20"/>
+        </w:rPr>
+        <w:t xml:space="preserve">▸  </w:t>
+      </w:r>
       <w:r>
         <w:rPr>
           <w:rFonts w:ascii="Calibri" w:cs="Calibri" w:eastAsia="Calibri" w:hAnsi="Calibri"/>
@@ -3304,13 +3488,18 @@
     </w:p>
     <w:p>
       <w:pPr>
-        <w:pStyle w:val="ListParagraph"/>
-        <w:numPr>
-          <w:ilvl w:val="0"/>
-          <w:numId w:val="1"/>
-        </w:numPr>
         <w:spacing w:after="80" w:before="0"/>
-      </w:pPr>
+        <w:ind w:left="480" w:hanging="320"/>
+      </w:pPr>
+      <w:r>
+        <w:rPr>
+          <w:rFonts w:ascii="Calibri" w:cs="Calibri" w:eastAsia="Calibri" w:hAnsi="Calibri"/>
+          <w:color w:val="01A1B7"/>
+          <w:sz w:val="20"/>
+          <w:szCs w:val="20"/>
+        </w:rPr>
+        <w:t xml:space="preserve">▸  </w:t>
+      </w:r>
       <w:r>
         <w:rPr>
           <w:rFonts w:ascii="Calibri" w:cs="Calibri" w:eastAsia="Calibri" w:hAnsi="Calibri"/>
@@ -3322,13 +3511,18 @@
     </w:p>
     <w:p>
       <w:pPr>
-        <w:pStyle w:val="ListParagraph"/>
-        <w:numPr>
-          <w:ilvl w:val="0"/>
-          <w:numId w:val="1"/>
-        </w:numPr>
         <w:spacing w:after="80" w:before="0"/>
-      </w:pPr>
+        <w:ind w:left="480" w:hanging="320"/>
+      </w:pPr>
+      <w:r>
+        <w:rPr>
+          <w:rFonts w:ascii="Calibri" w:cs="Calibri" w:eastAsia="Calibri" w:hAnsi="Calibri"/>
+          <w:color w:val="01A1B7"/>
+          <w:sz w:val="20"/>
+          <w:szCs w:val="20"/>
+        </w:rPr>
+        <w:t xml:space="preserve">▸  </w:t>
+      </w:r>
       <w:r>
         <w:rPr>
           <w:rFonts w:ascii="Calibri" w:cs="Calibri" w:eastAsia="Calibri" w:hAnsi="Calibri"/>
@@ -3340,13 +3534,18 @@
     </w:p>
     <w:p>
       <w:pPr>
-        <w:pStyle w:val="ListParagraph"/>
-        <w:numPr>
-          <w:ilvl w:val="0"/>
-          <w:numId w:val="1"/>
-        </w:numPr>
         <w:spacing w:after="80" w:before="0"/>
-      </w:pPr>
+        <w:ind w:left="480" w:hanging="320"/>
+      </w:pPr>
+      <w:r>
+        <w:rPr>
+          <w:rFonts w:ascii="Calibri" w:cs="Calibri" w:eastAsia="Calibri" w:hAnsi="Calibri"/>
+          <w:color w:val="01A1B7"/>
+          <w:sz w:val="20"/>
+          <w:szCs w:val="20"/>
+        </w:rPr>
+        <w:t xml:space="preserve">▸  </w:t>
+      </w:r>
       <w:r>
         <w:rPr>
           <w:rFonts w:ascii="Calibri" w:cs="Calibri" w:eastAsia="Calibri" w:hAnsi="Calibri"/>
@@ -3389,13 +3588,18 @@
     </w:p>
     <w:p>
       <w:pPr>
-        <w:pStyle w:val="ListParagraph"/>
-        <w:numPr>
-          <w:ilvl w:val="0"/>
-          <w:numId w:val="1"/>
-        </w:numPr>
         <w:spacing w:after="80" w:before="0"/>
-      </w:pPr>
+        <w:ind w:left="480" w:hanging="320"/>
+      </w:pPr>
+      <w:r>
+        <w:rPr>
+          <w:rFonts w:ascii="Calibri" w:cs="Calibri" w:eastAsia="Calibri" w:hAnsi="Calibri"/>
+          <w:color w:val="01A1B7"/>
+          <w:sz w:val="20"/>
+          <w:szCs w:val="20"/>
+        </w:rPr>
+        <w:t xml:space="preserve">▸  </w:t>
+      </w:r>
       <w:r>
         <w:rPr>
           <w:rFonts w:ascii="Calibri" w:cs="Calibri" w:eastAsia="Calibri" w:hAnsi="Calibri"/>
@@ -3407,13 +3611,18 @@
     </w:p>
     <w:p>
       <w:pPr>
-        <w:pStyle w:val="ListParagraph"/>
-        <w:numPr>
-          <w:ilvl w:val="0"/>
-          <w:numId w:val="1"/>
-        </w:numPr>
         <w:spacing w:after="80" w:before="0"/>
-      </w:pPr>
+        <w:ind w:left="480" w:hanging="320"/>
+      </w:pPr>
+      <w:r>
+        <w:rPr>
+          <w:rFonts w:ascii="Calibri" w:cs="Calibri" w:eastAsia="Calibri" w:hAnsi="Calibri"/>
+          <w:color w:val="01A1B7"/>
+          <w:sz w:val="20"/>
+          <w:szCs w:val="20"/>
+        </w:rPr>
+        <w:t xml:space="preserve">▸  </w:t>
+      </w:r>
       <w:r>
         <w:rPr>
           <w:rFonts w:ascii="Calibri" w:cs="Calibri" w:eastAsia="Calibri" w:hAnsi="Calibri"/>
@@ -3425,13 +3634,18 @@
     </w:p>
     <w:p>
       <w:pPr>
-        <w:pStyle w:val="ListParagraph"/>
-        <w:numPr>
-          <w:ilvl w:val="0"/>
-          <w:numId w:val="1"/>
-        </w:numPr>
         <w:spacing w:after="80" w:before="0"/>
-      </w:pPr>
+        <w:ind w:left="480" w:hanging="320"/>
+      </w:pPr>
+      <w:r>
+        <w:rPr>
+          <w:rFonts w:ascii="Calibri" w:cs="Calibri" w:eastAsia="Calibri" w:hAnsi="Calibri"/>
+          <w:color w:val="01A1B7"/>
+          <w:sz w:val="20"/>
+          <w:szCs w:val="20"/>
+        </w:rPr>
+        <w:t xml:space="preserve">▸  </w:t>
+      </w:r>
       <w:r>
         <w:rPr>
           <w:rFonts w:ascii="Calibri" w:cs="Calibri" w:eastAsia="Calibri" w:hAnsi="Calibri"/>
@@ -3443,13 +3657,18 @@
     </w:p>
     <w:p>
       <w:pPr>
-        <w:pStyle w:val="ListParagraph"/>
-        <w:numPr>
-          <w:ilvl w:val="0"/>
-          <w:numId w:val="1"/>
-        </w:numPr>
         <w:spacing w:after="80" w:before="0"/>
-      </w:pPr>
+        <w:ind w:left="480" w:hanging="320"/>
+      </w:pPr>
+      <w:r>
+        <w:rPr>
+          <w:rFonts w:ascii="Calibri" w:cs="Calibri" w:eastAsia="Calibri" w:hAnsi="Calibri"/>
+          <w:color w:val="01A1B7"/>
+          <w:sz w:val="20"/>
+          <w:szCs w:val="20"/>
+        </w:rPr>
+        <w:t xml:space="preserve">▸  </w:t>
+      </w:r>
       <w:r>
         <w:rPr>
           <w:rFonts w:ascii="Calibri" w:cs="Calibri" w:eastAsia="Calibri" w:hAnsi="Calibri"/>
@@ -3492,13 +3711,18 @@
     </w:p>
     <w:p>
       <w:pPr>
-        <w:pStyle w:val="ListParagraph"/>
-        <w:numPr>
-          <w:ilvl w:val="0"/>
-          <w:numId w:val="1"/>
-        </w:numPr>
         <w:spacing w:after="80" w:before="0"/>
-      </w:pPr>
+        <w:ind w:left="480" w:hanging="320"/>
+      </w:pPr>
+      <w:r>
+        <w:rPr>
+          <w:rFonts w:ascii="Calibri" w:cs="Calibri" w:eastAsia="Calibri" w:hAnsi="Calibri"/>
+          <w:color w:val="01A1B7"/>
+          <w:sz w:val="20"/>
+          <w:szCs w:val="20"/>
+        </w:rPr>
+        <w:t xml:space="preserve">▸  </w:t>
+      </w:r>
       <w:r>
         <w:rPr>
           <w:rFonts w:ascii="Calibri" w:cs="Calibri" w:eastAsia="Calibri" w:hAnsi="Calibri"/>
@@ -3510,13 +3734,18 @@
     </w:p>
     <w:p>
       <w:pPr>
-        <w:pStyle w:val="ListParagraph"/>
-        <w:numPr>
-          <w:ilvl w:val="0"/>
-          <w:numId w:val="1"/>
-        </w:numPr>
         <w:spacing w:after="80" w:before="0"/>
-      </w:pPr>
+        <w:ind w:left="480" w:hanging="320"/>
+      </w:pPr>
+      <w:r>
+        <w:rPr>
+          <w:rFonts w:ascii="Calibri" w:cs="Calibri" w:eastAsia="Calibri" w:hAnsi="Calibri"/>
+          <w:color w:val="01A1B7"/>
+          <w:sz w:val="20"/>
+          <w:szCs w:val="20"/>
+        </w:rPr>
+        <w:t xml:space="preserve">▸  </w:t>
+      </w:r>
       <w:r>
         <w:rPr>
           <w:rFonts w:ascii="Calibri" w:cs="Calibri" w:eastAsia="Calibri" w:hAnsi="Calibri"/>
@@ -3528,13 +3757,18 @@
     </w:p>
     <w:p>
       <w:pPr>
-        <w:pStyle w:val="ListParagraph"/>
-        <w:numPr>
-          <w:ilvl w:val="0"/>
-          <w:numId w:val="1"/>
-        </w:numPr>
         <w:spacing w:after="80" w:before="0"/>
-      </w:pPr>
+        <w:ind w:left="480" w:hanging="320"/>
+      </w:pPr>
+      <w:r>
+        <w:rPr>
+          <w:rFonts w:ascii="Calibri" w:cs="Calibri" w:eastAsia="Calibri" w:hAnsi="Calibri"/>
+          <w:color w:val="01A1B7"/>
+          <w:sz w:val="20"/>
+          <w:szCs w:val="20"/>
+        </w:rPr>
+        <w:t xml:space="preserve">▸  </w:t>
+      </w:r>
       <w:r>
         <w:rPr>
           <w:rFonts w:ascii="Calibri" w:cs="Calibri" w:eastAsia="Calibri" w:hAnsi="Calibri"/>
@@ -3546,13 +3780,18 @@
     </w:p>
     <w:p>
       <w:pPr>
-        <w:pStyle w:val="ListParagraph"/>
-        <w:numPr>
-          <w:ilvl w:val="0"/>
-          <w:numId w:val="1"/>
-        </w:numPr>
         <w:spacing w:after="80" w:before="0"/>
-      </w:pPr>
+        <w:ind w:left="480" w:hanging="320"/>
+      </w:pPr>
+      <w:r>
+        <w:rPr>
+          <w:rFonts w:ascii="Calibri" w:cs="Calibri" w:eastAsia="Calibri" w:hAnsi="Calibri"/>
+          <w:color w:val="01A1B7"/>
+          <w:sz w:val="20"/>
+          <w:szCs w:val="20"/>
+        </w:rPr>
+        <w:t xml:space="preserve">▸  </w:t>
+      </w:r>
       <w:r>
         <w:rPr>
           <w:rFonts w:ascii="Calibri" w:cs="Calibri" w:eastAsia="Calibri" w:hAnsi="Calibri"/>
@@ -4423,13 +4662,18 @@
     </w:p>
     <w:p>
       <w:pPr>
-        <w:pStyle w:val="ListParagraph"/>
-        <w:numPr>
-          <w:ilvl w:val="0"/>
-          <w:numId w:val="1"/>
-        </w:numPr>
         <w:spacing w:after="80" w:before="0"/>
-      </w:pPr>
+        <w:ind w:left="480" w:hanging="320"/>
+      </w:pPr>
+      <w:r>
+        <w:rPr>
+          <w:rFonts w:ascii="Calibri" w:cs="Calibri" w:eastAsia="Calibri" w:hAnsi="Calibri"/>
+          <w:color w:val="01A1B7"/>
+          <w:sz w:val="20"/>
+          <w:szCs w:val="20"/>
+        </w:rPr>
+        <w:t xml:space="preserve">▸  </w:t>
+      </w:r>
       <w:r>
         <w:rPr>
           <w:rFonts w:ascii="Calibri" w:cs="Calibri" w:eastAsia="Calibri" w:hAnsi="Calibri"/>
@@ -4441,13 +4685,18 @@
     </w:p>
     <w:p>
       <w:pPr>
-        <w:pStyle w:val="ListParagraph"/>
-        <w:numPr>
-          <w:ilvl w:val="0"/>
-          <w:numId w:val="1"/>
-        </w:numPr>
         <w:spacing w:after="80" w:before="0"/>
-      </w:pPr>
+        <w:ind w:left="480" w:hanging="320"/>
+      </w:pPr>
+      <w:r>
+        <w:rPr>
+          <w:rFonts w:ascii="Calibri" w:cs="Calibri" w:eastAsia="Calibri" w:hAnsi="Calibri"/>
+          <w:color w:val="01A1B7"/>
+          <w:sz w:val="20"/>
+          <w:szCs w:val="20"/>
+        </w:rPr>
+        <w:t xml:space="preserve">▸  </w:t>
+      </w:r>
       <w:r>
         <w:rPr>
           <w:rFonts w:ascii="Calibri" w:cs="Calibri" w:eastAsia="Calibri" w:hAnsi="Calibri"/>
@@ -4459,13 +4708,18 @@
     </w:p>
     <w:p>
       <w:pPr>
-        <w:pStyle w:val="ListParagraph"/>
-        <w:numPr>
-          <w:ilvl w:val="0"/>
-          <w:numId w:val="1"/>
-        </w:numPr>
         <w:spacing w:after="80" w:before="0"/>
-      </w:pPr>
+        <w:ind w:left="480" w:hanging="320"/>
+      </w:pPr>
+      <w:r>
+        <w:rPr>
+          <w:rFonts w:ascii="Calibri" w:cs="Calibri" w:eastAsia="Calibri" w:hAnsi="Calibri"/>
+          <w:color w:val="01A1B7"/>
+          <w:sz w:val="20"/>
+          <w:szCs w:val="20"/>
+        </w:rPr>
+        <w:t xml:space="preserve">▸  </w:t>
+      </w:r>
       <w:r>
         <w:rPr>
           <w:rFonts w:ascii="Calibri" w:cs="Calibri" w:eastAsia="Calibri" w:hAnsi="Calibri"/>
@@ -4477,13 +4731,18 @@
     </w:p>
     <w:p>
       <w:pPr>
-        <w:pStyle w:val="ListParagraph"/>
-        <w:numPr>
-          <w:ilvl w:val="0"/>
-          <w:numId w:val="1"/>
-        </w:numPr>
         <w:spacing w:after="80" w:before="0"/>
-      </w:pPr>
+        <w:ind w:left="480" w:hanging="320"/>
+      </w:pPr>
+      <w:r>
+        <w:rPr>
+          <w:rFonts w:ascii="Calibri" w:cs="Calibri" w:eastAsia="Calibri" w:hAnsi="Calibri"/>
+          <w:color w:val="01A1B7"/>
+          <w:sz w:val="20"/>
+          <w:szCs w:val="20"/>
+        </w:rPr>
+        <w:t xml:space="preserve">▸  </w:t>
+      </w:r>
       <w:r>
         <w:rPr>
           <w:rFonts w:ascii="Calibri" w:cs="Calibri" w:eastAsia="Calibri" w:hAnsi="Calibri"/>
@@ -4495,13 +4754,18 @@
     </w:p>
     <w:p>
       <w:pPr>
-        <w:pStyle w:val="ListParagraph"/>
-        <w:numPr>
-          <w:ilvl w:val="0"/>
-          <w:numId w:val="1"/>
-        </w:numPr>
         <w:spacing w:after="80" w:before="0"/>
-      </w:pPr>
+        <w:ind w:left="480" w:hanging="320"/>
+      </w:pPr>
+      <w:r>
+        <w:rPr>
+          <w:rFonts w:ascii="Calibri" w:cs="Calibri" w:eastAsia="Calibri" w:hAnsi="Calibri"/>
+          <w:color w:val="01A1B7"/>
+          <w:sz w:val="20"/>
+          <w:szCs w:val="20"/>
+        </w:rPr>
+        <w:t xml:space="preserve">▸  </w:t>
+      </w:r>
       <w:r>
         <w:rPr>
           <w:rFonts w:ascii="Calibri" w:cs="Calibri" w:eastAsia="Calibri" w:hAnsi="Calibri"/>
@@ -4561,13 +4825,18 @@
     </w:p>
     <w:p>
       <w:pPr>
-        <w:pStyle w:val="ListParagraph"/>
-        <w:numPr>
-          <w:ilvl w:val="0"/>
-          <w:numId w:val="1"/>
-        </w:numPr>
         <w:spacing w:after="80" w:before="0"/>
-      </w:pPr>
+        <w:ind w:left="480" w:hanging="320"/>
+      </w:pPr>
+      <w:r>
+        <w:rPr>
+          <w:rFonts w:ascii="Calibri" w:cs="Calibri" w:eastAsia="Calibri" w:hAnsi="Calibri"/>
+          <w:color w:val="01A1B7"/>
+          <w:sz w:val="20"/>
+          <w:szCs w:val="20"/>
+        </w:rPr>
+        <w:t xml:space="preserve">▸  </w:t>
+      </w:r>
       <w:r>
         <w:rPr>
           <w:rFonts w:ascii="Calibri" w:cs="Calibri" w:eastAsia="Calibri" w:hAnsi="Calibri"/>
@@ -4579,13 +4848,18 @@
     </w:p>
     <w:p>
       <w:pPr>
-        <w:pStyle w:val="ListParagraph"/>
-        <w:numPr>
-          <w:ilvl w:val="0"/>
-          <w:numId w:val="1"/>
-        </w:numPr>
         <w:spacing w:after="80" w:before="0"/>
-      </w:pPr>
+        <w:ind w:left="480" w:hanging="320"/>
+      </w:pPr>
+      <w:r>
+        <w:rPr>
+          <w:rFonts w:ascii="Calibri" w:cs="Calibri" w:eastAsia="Calibri" w:hAnsi="Calibri"/>
+          <w:color w:val="01A1B7"/>
+          <w:sz w:val="20"/>
+          <w:szCs w:val="20"/>
+        </w:rPr>
+        <w:t xml:space="preserve">▸  </w:t>
+      </w:r>
       <w:r>
         <w:rPr>
           <w:rFonts w:ascii="Calibri" w:cs="Calibri" w:eastAsia="Calibri" w:hAnsi="Calibri"/>
@@ -4597,13 +4871,18 @@
     </w:p>
     <w:p>
       <w:pPr>
-        <w:pStyle w:val="ListParagraph"/>
-        <w:numPr>
-          <w:ilvl w:val="0"/>
-          <w:numId w:val="1"/>
-        </w:numPr>
         <w:spacing w:after="80" w:before="0"/>
-      </w:pPr>
+        <w:ind w:left="480" w:hanging="320"/>
+      </w:pPr>
+      <w:r>
+        <w:rPr>
+          <w:rFonts w:ascii="Calibri" w:cs="Calibri" w:eastAsia="Calibri" w:hAnsi="Calibri"/>
+          <w:color w:val="01A1B7"/>
+          <w:sz w:val="20"/>
+          <w:szCs w:val="20"/>
+        </w:rPr>
+        <w:t xml:space="preserve">▸  </w:t>
+      </w:r>
       <w:r>
         <w:rPr>
           <w:rFonts w:ascii="Calibri" w:cs="Calibri" w:eastAsia="Calibri" w:hAnsi="Calibri"/>
@@ -4615,13 +4894,18 @@
     </w:p>
     <w:p>
       <w:pPr>
-        <w:pStyle w:val="ListParagraph"/>
-        <w:numPr>
-          <w:ilvl w:val="0"/>
-          <w:numId w:val="1"/>
-        </w:numPr>
         <w:spacing w:after="80" w:before="0"/>
-      </w:pPr>
+        <w:ind w:left="480" w:hanging="320"/>
+      </w:pPr>
+      <w:r>
+        <w:rPr>
+          <w:rFonts w:ascii="Calibri" w:cs="Calibri" w:eastAsia="Calibri" w:hAnsi="Calibri"/>
+          <w:color w:val="01A1B7"/>
+          <w:sz w:val="20"/>
+          <w:szCs w:val="20"/>
+        </w:rPr>
+        <w:t xml:space="preserve">▸  </w:t>
+      </w:r>
       <w:r>
         <w:rPr>
           <w:rFonts w:ascii="Calibri" w:cs="Calibri" w:eastAsia="Calibri" w:hAnsi="Calibri"/>
@@ -5197,13 +5481,18 @@
     </w:p>
     <w:p>
       <w:pPr>
-        <w:pStyle w:val="ListParagraph"/>
-        <w:numPr>
-          <w:ilvl w:val="0"/>
-          <w:numId w:val="1"/>
-        </w:numPr>
         <w:spacing w:after="80" w:before="0"/>
-      </w:pPr>
+        <w:ind w:left="480" w:hanging="320"/>
+      </w:pPr>
+      <w:r>
+        <w:rPr>
+          <w:rFonts w:ascii="Calibri" w:cs="Calibri" w:eastAsia="Calibri" w:hAnsi="Calibri"/>
+          <w:color w:val="01A1B7"/>
+          <w:sz w:val="20"/>
+          <w:szCs w:val="20"/>
+        </w:rPr>
+        <w:t xml:space="preserve">▸  </w:t>
+      </w:r>
       <w:r>
         <w:rPr>
           <w:rFonts w:ascii="Calibri" w:cs="Calibri" w:eastAsia="Calibri" w:hAnsi="Calibri"/>
@@ -5215,13 +5504,18 @@
     </w:p>
     <w:p>
       <w:pPr>
-        <w:pStyle w:val="ListParagraph"/>
-        <w:numPr>
-          <w:ilvl w:val="0"/>
-          <w:numId w:val="1"/>
-        </w:numPr>
         <w:spacing w:after="80" w:before="0"/>
-      </w:pPr>
+        <w:ind w:left="480" w:hanging="320"/>
+      </w:pPr>
+      <w:r>
+        <w:rPr>
+          <w:rFonts w:ascii="Calibri" w:cs="Calibri" w:eastAsia="Calibri" w:hAnsi="Calibri"/>
+          <w:color w:val="01A1B7"/>
+          <w:sz w:val="20"/>
+          <w:szCs w:val="20"/>
+        </w:rPr>
+        <w:t xml:space="preserve">▸  </w:t>
+      </w:r>
       <w:r>
         <w:rPr>
           <w:rFonts w:ascii="Calibri" w:cs="Calibri" w:eastAsia="Calibri" w:hAnsi="Calibri"/>
@@ -5233,13 +5527,18 @@
     </w:p>
     <w:p>
       <w:pPr>
-        <w:pStyle w:val="ListParagraph"/>
-        <w:numPr>
-          <w:ilvl w:val="0"/>
-          <w:numId w:val="1"/>
-        </w:numPr>
         <w:spacing w:after="80" w:before="0"/>
-      </w:pPr>
+        <w:ind w:left="480" w:hanging="320"/>
+      </w:pPr>
+      <w:r>
+        <w:rPr>
+          <w:rFonts w:ascii="Calibri" w:cs="Calibri" w:eastAsia="Calibri" w:hAnsi="Calibri"/>
+          <w:color w:val="01A1B7"/>
+          <w:sz w:val="20"/>
+          <w:szCs w:val="20"/>
+        </w:rPr>
+        <w:t xml:space="preserve">▸  </w:t>
+      </w:r>
       <w:r>
         <w:rPr>
           <w:rFonts w:ascii="Calibri" w:cs="Calibri" w:eastAsia="Calibri" w:hAnsi="Calibri"/>
@@ -6922,13 +7221,18 @@
     </w:p>
     <w:p>
       <w:pPr>
-        <w:pStyle w:val="ListParagraph"/>
-        <w:numPr>
-          <w:ilvl w:val="0"/>
-          <w:numId w:val="1"/>
-        </w:numPr>
         <w:spacing w:after="80" w:before="0"/>
-      </w:pPr>
+        <w:ind w:left="480" w:hanging="320"/>
+      </w:pPr>
+      <w:r>
+        <w:rPr>
+          <w:rFonts w:ascii="Calibri" w:cs="Calibri" w:eastAsia="Calibri" w:hAnsi="Calibri"/>
+          <w:color w:val="01A1B7"/>
+          <w:sz w:val="20"/>
+          <w:szCs w:val="20"/>
+        </w:rPr>
+        <w:t xml:space="preserve">▸  </w:t>
+      </w:r>
       <w:r>
         <w:rPr>
           <w:rFonts w:ascii="Calibri" w:cs="Calibri" w:eastAsia="Calibri" w:hAnsi="Calibri"/>
@@ -6940,13 +7244,18 @@
     </w:p>
     <w:p>
       <w:pPr>
-        <w:pStyle w:val="ListParagraph"/>
-        <w:numPr>
-          <w:ilvl w:val="0"/>
-          <w:numId w:val="1"/>
-        </w:numPr>
         <w:spacing w:after="80" w:before="0"/>
-      </w:pPr>
+        <w:ind w:left="480" w:hanging="320"/>
+      </w:pPr>
+      <w:r>
+        <w:rPr>
+          <w:rFonts w:ascii="Calibri" w:cs="Calibri" w:eastAsia="Calibri" w:hAnsi="Calibri"/>
+          <w:color w:val="01A1B7"/>
+          <w:sz w:val="20"/>
+          <w:szCs w:val="20"/>
+        </w:rPr>
+        <w:t xml:space="preserve">▸  </w:t>
+      </w:r>
       <w:r>
         <w:rPr>
           <w:rFonts w:ascii="Calibri" w:cs="Calibri" w:eastAsia="Calibri" w:hAnsi="Calibri"/>
@@ -6958,13 +7267,18 @@
     </w:p>
     <w:p>
       <w:pPr>
-        <w:pStyle w:val="ListParagraph"/>
-        <w:numPr>
-          <w:ilvl w:val="0"/>
-          <w:numId w:val="1"/>
-        </w:numPr>
         <w:spacing w:after="80" w:before="0"/>
-      </w:pPr>
+        <w:ind w:left="480" w:hanging="320"/>
+      </w:pPr>
+      <w:r>
+        <w:rPr>
+          <w:rFonts w:ascii="Calibri" w:cs="Calibri" w:eastAsia="Calibri" w:hAnsi="Calibri"/>
+          <w:color w:val="01A1B7"/>
+          <w:sz w:val="20"/>
+          <w:szCs w:val="20"/>
+        </w:rPr>
+        <w:t xml:space="preserve">▸  </w:t>
+      </w:r>
       <w:r>
         <w:rPr>
           <w:rFonts w:ascii="Calibri" w:cs="Calibri" w:eastAsia="Calibri" w:hAnsi="Calibri"/>
@@ -6976,13 +7290,18 @@
     </w:p>
     <w:p>
       <w:pPr>
-        <w:pStyle w:val="ListParagraph"/>
-        <w:numPr>
-          <w:ilvl w:val="0"/>
-          <w:numId w:val="1"/>
-        </w:numPr>
         <w:spacing w:after="80" w:before="0"/>
-      </w:pPr>
+        <w:ind w:left="480" w:hanging="320"/>
+      </w:pPr>
+      <w:r>
+        <w:rPr>
+          <w:rFonts w:ascii="Calibri" w:cs="Calibri" w:eastAsia="Calibri" w:hAnsi="Calibri"/>
+          <w:color w:val="01A1B7"/>
+          <w:sz w:val="20"/>
+          <w:szCs w:val="20"/>
+        </w:rPr>
+        <w:t xml:space="preserve">▸  </w:t>
+      </w:r>
       <w:r>
         <w:rPr>
           <w:rFonts w:ascii="Calibri" w:cs="Calibri" w:eastAsia="Calibri" w:hAnsi="Calibri"/>
@@ -6994,13 +7313,18 @@
     </w:p>
     <w:p>
       <w:pPr>
-        <w:pStyle w:val="ListParagraph"/>
-        <w:numPr>
-          <w:ilvl w:val="0"/>
-          <w:numId w:val="1"/>
-        </w:numPr>
         <w:spacing w:after="80" w:before="0"/>
-      </w:pPr>
+        <w:ind w:left="480" w:hanging="320"/>
+      </w:pPr>
+      <w:r>
+        <w:rPr>
+          <w:rFonts w:ascii="Calibri" w:cs="Calibri" w:eastAsia="Calibri" w:hAnsi="Calibri"/>
+          <w:color w:val="01A1B7"/>
+          <w:sz w:val="20"/>
+          <w:szCs w:val="20"/>
+        </w:rPr>
+        <w:t xml:space="preserve">▸  </w:t>
+      </w:r>
       <w:r>
         <w:rPr>
           <w:rFonts w:ascii="Calibri" w:cs="Calibri" w:eastAsia="Calibri" w:hAnsi="Calibri"/>
@@ -7043,13 +7367,18 @@
     </w:p>
     <w:p>
       <w:pPr>
-        <w:pStyle w:val="ListParagraph"/>
-        <w:numPr>
-          <w:ilvl w:val="0"/>
-          <w:numId w:val="1"/>
-        </w:numPr>
         <w:spacing w:after="80" w:before="0"/>
-      </w:pPr>
+        <w:ind w:left="480" w:hanging="320"/>
+      </w:pPr>
+      <w:r>
+        <w:rPr>
+          <w:rFonts w:ascii="Calibri" w:cs="Calibri" w:eastAsia="Calibri" w:hAnsi="Calibri"/>
+          <w:color w:val="01A1B7"/>
+          <w:sz w:val="20"/>
+          <w:szCs w:val="20"/>
+        </w:rPr>
+        <w:t xml:space="preserve">▸  </w:t>
+      </w:r>
       <w:r>
         <w:rPr>
           <w:rFonts w:ascii="Calibri" w:cs="Calibri" w:eastAsia="Calibri" w:hAnsi="Calibri"/>
@@ -7061,13 +7390,18 @@
     </w:p>
     <w:p>
       <w:pPr>
-        <w:pStyle w:val="ListParagraph"/>
-        <w:numPr>
-          <w:ilvl w:val="0"/>
-          <w:numId w:val="1"/>
-        </w:numPr>
         <w:spacing w:after="80" w:before="0"/>
-      </w:pPr>
+        <w:ind w:left="480" w:hanging="320"/>
+      </w:pPr>
+      <w:r>
+        <w:rPr>
+          <w:rFonts w:ascii="Calibri" w:cs="Calibri" w:eastAsia="Calibri" w:hAnsi="Calibri"/>
+          <w:color w:val="01A1B7"/>
+          <w:sz w:val="20"/>
+          <w:szCs w:val="20"/>
+        </w:rPr>
+        <w:t xml:space="preserve">▸  </w:t>
+      </w:r>
       <w:r>
         <w:rPr>
           <w:rFonts w:ascii="Calibri" w:cs="Calibri" w:eastAsia="Calibri" w:hAnsi="Calibri"/>
@@ -7079,13 +7413,18 @@
     </w:p>
     <w:p>
       <w:pPr>
-        <w:pStyle w:val="ListParagraph"/>
-        <w:numPr>
-          <w:ilvl w:val="0"/>
-          <w:numId w:val="1"/>
-        </w:numPr>
         <w:spacing w:after="80" w:before="0"/>
-      </w:pPr>
+        <w:ind w:left="480" w:hanging="320"/>
+      </w:pPr>
+      <w:r>
+        <w:rPr>
+          <w:rFonts w:ascii="Calibri" w:cs="Calibri" w:eastAsia="Calibri" w:hAnsi="Calibri"/>
+          <w:color w:val="01A1B7"/>
+          <w:sz w:val="20"/>
+          <w:szCs w:val="20"/>
+        </w:rPr>
+        <w:t xml:space="preserve">▸  </w:t>
+      </w:r>
       <w:r>
         <w:rPr>
           <w:rFonts w:ascii="Calibri" w:cs="Calibri" w:eastAsia="Calibri" w:hAnsi="Calibri"/>
@@ -7097,13 +7436,18 @@
     </w:p>
     <w:p>
       <w:pPr>
-        <w:pStyle w:val="ListParagraph"/>
-        <w:numPr>
-          <w:ilvl w:val="0"/>
-          <w:numId w:val="1"/>
-        </w:numPr>
         <w:spacing w:after="80" w:before="0"/>
-      </w:pPr>
+        <w:ind w:left="480" w:hanging="320"/>
+      </w:pPr>
+      <w:r>
+        <w:rPr>
+          <w:rFonts w:ascii="Calibri" w:cs="Calibri" w:eastAsia="Calibri" w:hAnsi="Calibri"/>
+          <w:color w:val="01A1B7"/>
+          <w:sz w:val="20"/>
+          <w:szCs w:val="20"/>
+        </w:rPr>
+        <w:t xml:space="preserve">▸  </w:t>
+      </w:r>
       <w:r>
         <w:rPr>
           <w:rFonts w:ascii="Calibri" w:cs="Calibri" w:eastAsia="Calibri" w:hAnsi="Calibri"/>
@@ -7115,13 +7459,18 @@
     </w:p>
     <w:p>
       <w:pPr>
-        <w:pStyle w:val="ListParagraph"/>
-        <w:numPr>
-          <w:ilvl w:val="0"/>
-          <w:numId w:val="1"/>
-        </w:numPr>
         <w:spacing w:after="80" w:before="0"/>
-      </w:pPr>
+        <w:ind w:left="480" w:hanging="320"/>
+      </w:pPr>
+      <w:r>
+        <w:rPr>
+          <w:rFonts w:ascii="Calibri" w:cs="Calibri" w:eastAsia="Calibri" w:hAnsi="Calibri"/>
+          <w:color w:val="01A1B7"/>
+          <w:sz w:val="20"/>
+          <w:szCs w:val="20"/>
+        </w:rPr>
+        <w:t xml:space="preserve">▸  </w:t>
+      </w:r>
       <w:r>
         <w:rPr>
           <w:rFonts w:ascii="Calibri" w:cs="Calibri" w:eastAsia="Calibri" w:hAnsi="Calibri"/>
@@ -7133,13 +7482,18 @@
     </w:p>
     <w:p>
       <w:pPr>
-        <w:pStyle w:val="ListParagraph"/>
-        <w:numPr>
-          <w:ilvl w:val="0"/>
-          <w:numId w:val="1"/>
-        </w:numPr>
         <w:spacing w:after="80" w:before="0"/>
-      </w:pPr>
+        <w:ind w:left="480" w:hanging="320"/>
+      </w:pPr>
+      <w:r>
+        <w:rPr>
+          <w:rFonts w:ascii="Calibri" w:cs="Calibri" w:eastAsia="Calibri" w:hAnsi="Calibri"/>
+          <w:color w:val="01A1B7"/>
+          <w:sz w:val="20"/>
+          <w:szCs w:val="20"/>
+        </w:rPr>
+        <w:t xml:space="preserve">▸  </w:t>
+      </w:r>
       <w:r>
         <w:rPr>
           <w:rFonts w:ascii="Calibri" w:cs="Calibri" w:eastAsia="Calibri" w:hAnsi="Calibri"/>
@@ -7182,13 +7536,18 @@
     </w:p>
     <w:p>
       <w:pPr>
-        <w:pStyle w:val="ListParagraph"/>
-        <w:numPr>
-          <w:ilvl w:val="0"/>
-          <w:numId w:val="1"/>
-        </w:numPr>
         <w:spacing w:after="80" w:before="0"/>
-      </w:pPr>
+        <w:ind w:left="480" w:hanging="320"/>
+      </w:pPr>
+      <w:r>
+        <w:rPr>
+          <w:rFonts w:ascii="Calibri" w:cs="Calibri" w:eastAsia="Calibri" w:hAnsi="Calibri"/>
+          <w:color w:val="01A1B7"/>
+          <w:sz w:val="20"/>
+          <w:szCs w:val="20"/>
+        </w:rPr>
+        <w:t xml:space="preserve">▸  </w:t>
+      </w:r>
       <w:r>
         <w:rPr>
           <w:rFonts w:ascii="Calibri" w:cs="Calibri" w:eastAsia="Calibri" w:hAnsi="Calibri"/>
@@ -7200,13 +7559,18 @@
     </w:p>
     <w:p>
       <w:pPr>
-        <w:pStyle w:val="ListParagraph"/>
-        <w:numPr>
-          <w:ilvl w:val="0"/>
-          <w:numId w:val="1"/>
-        </w:numPr>
         <w:spacing w:after="80" w:before="0"/>
-      </w:pPr>
+        <w:ind w:left="480" w:hanging="320"/>
+      </w:pPr>
+      <w:r>
+        <w:rPr>
+          <w:rFonts w:ascii="Calibri" w:cs="Calibri" w:eastAsia="Calibri" w:hAnsi="Calibri"/>
+          <w:color w:val="01A1B7"/>
+          <w:sz w:val="20"/>
+          <w:szCs w:val="20"/>
+        </w:rPr>
+        <w:t xml:space="preserve">▸  </w:t>
+      </w:r>
       <w:r>
         <w:rPr>
           <w:rFonts w:ascii="Calibri" w:cs="Calibri" w:eastAsia="Calibri" w:hAnsi="Calibri"/>
@@ -7218,13 +7582,18 @@
     </w:p>
     <w:p>
       <w:pPr>
-        <w:pStyle w:val="ListParagraph"/>
-        <w:numPr>
-          <w:ilvl w:val="0"/>
-          <w:numId w:val="1"/>
-        </w:numPr>
         <w:spacing w:after="80" w:before="0"/>
-      </w:pPr>
+        <w:ind w:left="480" w:hanging="320"/>
+      </w:pPr>
+      <w:r>
+        <w:rPr>
+          <w:rFonts w:ascii="Calibri" w:cs="Calibri" w:eastAsia="Calibri" w:hAnsi="Calibri"/>
+          <w:color w:val="01A1B7"/>
+          <w:sz w:val="20"/>
+          <w:szCs w:val="20"/>
+        </w:rPr>
+        <w:t xml:space="preserve">▸  </w:t>
+      </w:r>
       <w:r>
         <w:rPr>
           <w:rFonts w:ascii="Calibri" w:cs="Calibri" w:eastAsia="Calibri" w:hAnsi="Calibri"/>

</xml_diff>